<commit_message>
Update: Add README.md and fix all fonts to Times New Roman in template
</commit_message>
<xml_diff>
--- a/templates/Template_SK.docx
+++ b/templates/Template_SK.docx
@@ -57,10 +57,14 @@
           <w:lang w:val="sv-SE"/>
         </w:rPr>
       </w:pPr>
-      <w:r/>
-      <w:r>
-        <w:rPr>
-          <w:rFonts w:ascii="Times New Roman" w:hAnsi="Times New Roman"/>
+      <w:r>
+        <w:rPr>
+          <w:rFonts w:ascii="Times New Roman" w:hAnsi="Times New Roman" w:cs="Times New Roman" w:eastAsia="Times New Roman"/>
+        </w:rPr>
+      </w:r>
+      <w:r>
+        <w:rPr>
+          <w:rFonts w:ascii="Times New Roman" w:hAnsi="Times New Roman" w:cs="Times New Roman" w:eastAsia="Times New Roman"/>
           <w:sz w:val="24"/>
         </w:rPr>
         <w:t>No. 014/SK/ARSC/VI/2026</w:t>
@@ -359,6 +363,9 @@
         </w:rPr>
       </w:pPr>
       <w:r>
+        <w:rPr>
+          <w:rFonts w:ascii="Times New Roman" w:hAnsi="Times New Roman" w:cs="Times New Roman" w:eastAsia="Times New Roman"/>
+        </w:rPr>
         <w:t>Nama : [NAMA]</w:t>
       </w:r>
     </w:p>
@@ -382,6 +389,9 @@
         </w:rPr>
       </w:pPr>
       <w:r>
+        <w:rPr>
+          <w:rFonts w:ascii="Times New Roman" w:hAnsi="Times New Roman" w:cs="Times New Roman" w:eastAsia="Times New Roman"/>
+        </w:rPr>
         <w:t>NIM : [NIM]</w:t>
       </w:r>
     </w:p>
@@ -406,6 +416,9 @@
         </w:rPr>
       </w:pPr>
       <w:r>
+        <w:rPr>
+          <w:rFonts w:ascii="Times New Roman" w:hAnsi="Times New Roman" w:cs="Times New Roman" w:eastAsia="Times New Roman"/>
+        </w:rPr>
         <w:t>Departemen : [DEPARTEMEN]</w:t>
       </w:r>
     </w:p>
@@ -430,6 +443,9 @@
         </w:rPr>
       </w:pPr>
       <w:r>
+        <w:rPr>
+          <w:rFonts w:ascii="Times New Roman" w:hAnsi="Times New Roman" w:cs="Times New Roman" w:eastAsia="Times New Roman"/>
+        </w:rPr>
         <w:t>Program Studi : [PROGRAM_STUDI]</w:t>
       </w:r>
     </w:p>
@@ -453,10 +469,14 @@
           <w:lang w:val="sv-SE"/>
         </w:rPr>
       </w:pPr>
-      <w:r/>
-      <w:r>
-        <w:rPr>
-          <w:rFonts w:ascii="Times New Roman" w:hAnsi="Times New Roman"/>
+      <w:r>
+        <w:rPr>
+          <w:rFonts w:ascii="Times New Roman" w:hAnsi="Times New Roman" w:cs="Times New Roman" w:eastAsia="Times New Roman"/>
+        </w:rPr>
+      </w:r>
+      <w:r>
+        <w:rPr>
+          <w:rFonts w:ascii="Times New Roman" w:hAnsi="Times New Roman" w:cs="Times New Roman" w:eastAsia="Times New Roman"/>
           <w:sz w:val="24"/>
         </w:rPr>
         <w:t>Jabatan : Anggota Muda Bidang Penulisan dan Kompetisi (PENKOM)</w:t>
@@ -555,6 +575,7 @@
       </w:pPr>
       <w:r>
         <w:rPr>
+          <w:rFonts w:ascii="Times New Roman" w:hAnsi="Times New Roman" w:cs="Times New Roman" w:eastAsia="Times New Roman"/>
           <w:noProof/>
         </w:rPr>
         <w:drawing>
@@ -623,6 +644,9 @@
         </w:rPr>
       </w:pPr>
       <w:r>
+        <w:rPr>
+          <w:rFonts w:ascii="Times New Roman" w:hAnsi="Times New Roman" w:cs="Times New Roman" w:eastAsia="Times New Roman"/>
+        </w:rPr>
         <w:t>Malang, [TANGGAL_SURAT]</w:t>
       </w:r>
     </w:p>
@@ -1547,6 +1571,10 @@
   <w:style w:type="paragraph" w:default="1" w:styleId="Normal">
     <w:name w:val="Normal"/>
     <w:qFormat/>
+    <w:rPr>
+      <w:rFonts w:ascii="Times New Roman" w:hAnsi="Times New Roman"/>
+      <w:sz w:val="24"/>
+    </w:rPr>
   </w:style>
   <w:style w:type="paragraph" w:styleId="Heading1">
     <w:name w:val="heading 1"/>

</xml_diff>